<commit_message>
Sắp xếp lại thư mục
</commit_message>
<xml_diff>
--- a/Lý thuyết.docx
+++ b/Lý thuyết.docx
@@ -4,58 +4,22 @@
   <w:body>
     <w:p>
       <w:pPr>
-        <w:rPr>
-          <w:rFonts w:ascii="Times  New Roman" w:hAnsi="Times  New Roman"/>
-          <w:sz w:val="26"/>
-          <w:szCs w:val="26"/>
-          <w:lang w:val="vi-VN"/>
-        </w:rPr>
-      </w:pPr>
-      <w:r>
-        <w:rPr>
-          <w:rFonts w:ascii="Times  New Roman" w:hAnsi="Times  New Roman"/>
-          <w:sz w:val="26"/>
-          <w:szCs w:val="26"/>
-          <w:lang w:val="vi-VN"/>
-        </w:rPr>
-        <w:tab/>
-      </w:r>
-      <w:r>
-        <w:rPr>
-          <w:rFonts w:ascii="Times  New Roman" w:hAnsi="Times  New Roman"/>
-          <w:sz w:val="26"/>
-          <w:szCs w:val="26"/>
-          <w:lang w:val="vi-VN"/>
-        </w:rPr>
-        <w:tab/>
-      </w:r>
-      <w:r>
-        <w:rPr>
-          <w:rFonts w:ascii="Times  New Roman" w:hAnsi="Times  New Roman"/>
-          <w:sz w:val="26"/>
-          <w:szCs w:val="26"/>
-          <w:lang w:val="vi-VN"/>
-        </w:rPr>
-        <w:tab/>
-      </w:r>
-      <w:r>
-        <w:rPr>
-          <w:rFonts w:ascii="Times  New Roman" w:hAnsi="Times  New Roman"/>
-          <w:sz w:val="26"/>
-          <w:szCs w:val="26"/>
-          <w:lang w:val="vi-VN"/>
-        </w:rPr>
-        <w:tab/>
-      </w:r>
-      <w:r>
-        <w:rPr>
-          <w:rFonts w:ascii="Times  New Roman" w:hAnsi="Times  New Roman"/>
-          <w:sz w:val="26"/>
-          <w:szCs w:val="26"/>
-          <w:lang w:val="vi-VN"/>
-        </w:rPr>
-        <w:tab/>
-        <w:t>BUỔI 2</w:t>
+        <w:jc w:val="center"/>
+        <w:rPr>
+          <w:rFonts w:ascii="Times  New Roman" w:hAnsi="Times  New Roman"/>
+          <w:sz w:val="26"/>
+          <w:szCs w:val="26"/>
+          <w:lang w:val="vi-VN"/>
+        </w:rPr>
+      </w:pPr>
+      <w:r>
+        <w:rPr>
+          <w:rFonts w:ascii="Times  New Roman" w:hAnsi="Times  New Roman"/>
+          <w:sz w:val="26"/>
+          <w:szCs w:val="26"/>
+          <w:lang w:val="vi-VN"/>
+        </w:rPr>
+        <w:t>AGENT (TÁC NHÂN)</w:t>
       </w:r>
     </w:p>
     <w:p>
@@ -1378,8 +1342,10 @@
       <w:r>
         <w:rPr>
           <w:rFonts w:ascii="Times  New Roman" w:hAnsi="Times  New Roman"/>
-          <w:sz w:val="26"/>
-          <w:szCs w:val="26"/>
+          <w:color w:val="EE0000"/>
+          <w:sz w:val="26"/>
+          <w:szCs w:val="26"/>
+          <w:highlight w:val="yellow"/>
           <w:lang w:val="vi-VN"/>
         </w:rPr>
         <w:t>Simple r</w:t>
@@ -1387,10 +1353,20 @@
       <w:r>
         <w:rPr>
           <w:rFonts w:ascii="Times  New Roman" w:hAnsi="Times  New Roman"/>
-          <w:sz w:val="26"/>
-          <w:szCs w:val="26"/>
-        </w:rPr>
-        <w:t>eflex agent:</w:t>
+          <w:color w:val="EE0000"/>
+          <w:sz w:val="26"/>
+          <w:szCs w:val="26"/>
+          <w:highlight w:val="yellow"/>
+        </w:rPr>
+        <w:t>eflex agent</w:t>
+      </w:r>
+      <w:r>
+        <w:rPr>
+          <w:rFonts w:ascii="Times  New Roman" w:hAnsi="Times  New Roman"/>
+          <w:sz w:val="26"/>
+          <w:szCs w:val="26"/>
+        </w:rPr>
+        <w:t>:</w:t>
       </w:r>
       <w:r>
         <w:rPr>
@@ -1476,7 +1452,34 @@
           <w:szCs w:val="26"/>
           <w:lang w:val="vi-VN"/>
         </w:rPr>
-        <w:t>if state = (0,0) then action = random (R, D)</w:t>
+        <w:t>state &lt;- INTERPRET-INPUT(</w:t>
+      </w:r>
+      <w:r>
+        <w:rPr>
+          <w:rFonts w:ascii="Times  New Roman" w:hAnsi="Times  New Roman"/>
+          <w:sz w:val="26"/>
+          <w:szCs w:val="26"/>
+          <w:lang w:val="vi-VN"/>
+        </w:rPr>
+        <w:t>percept</w:t>
+      </w:r>
+      <w:r>
+        <w:rPr>
+          <w:rFonts w:ascii="Times  New Roman" w:hAnsi="Times  New Roman"/>
+          <w:sz w:val="26"/>
+          <w:szCs w:val="26"/>
+          <w:lang w:val="vi-VN"/>
+        </w:rPr>
+        <w:t>)</w:t>
+      </w:r>
+      <w:r>
+        <w:rPr>
+          <w:rFonts w:ascii="Times  New Roman" w:hAnsi="Times  New Roman"/>
+          <w:sz w:val="26"/>
+          <w:szCs w:val="26"/>
+          <w:lang w:val="vi-VN"/>
+        </w:rPr>
+        <w:t xml:space="preserve"> (8 puzzle: vị trí ô trống hiện tại)</w:t>
       </w:r>
     </w:p>
     <w:p>
@@ -1489,6 +1492,15 @@
           <w:lang w:val="vi-VN"/>
         </w:rPr>
       </w:pPr>
+      <w:r>
+        <w:rPr>
+          <w:rFonts w:ascii="Times  New Roman" w:hAnsi="Times  New Roman"/>
+          <w:sz w:val="26"/>
+          <w:szCs w:val="26"/>
+          <w:lang w:val="vi-VN"/>
+        </w:rPr>
+        <w:t>rule &lt;- RULE-MATCH (state, rule)</w:t>
+      </w:r>
     </w:p>
     <w:p>
       <w:pPr>
@@ -1507,7 +1519,7 @@
           <w:szCs w:val="26"/>
           <w:lang w:val="vi-VN"/>
         </w:rPr>
-        <w:t>state &lt;- INTERPRET-INPUT(percept)</w:t>
+        <w:t>action &lt;- rule.ACTION</w:t>
       </w:r>
     </w:p>
     <w:p>
@@ -1527,37 +1539,547 @@
           <w:szCs w:val="26"/>
           <w:lang w:val="vi-VN"/>
         </w:rPr>
-        <w:t>rule &lt;- RULE-MATCH (state, rule)</w:t>
-      </w:r>
-    </w:p>
-    <w:p>
-      <w:pPr>
-        <w:ind w:firstLine="720"/>
-        <w:rPr>
-          <w:rFonts w:ascii="Times  New Roman" w:hAnsi="Times  New Roman"/>
-          <w:sz w:val="26"/>
-          <w:szCs w:val="26"/>
-          <w:lang w:val="vi-VN"/>
-        </w:rPr>
-      </w:pPr>
-      <w:r>
-        <w:rPr>
-          <w:rFonts w:ascii="Times  New Roman" w:hAnsi="Times  New Roman"/>
-          <w:sz w:val="26"/>
-          <w:szCs w:val="26"/>
-          <w:lang w:val="vi-VN"/>
+        <w:t>return action</w:t>
+      </w:r>
+    </w:p>
+    <w:p>
+      <w:pPr>
+        <w:rPr>
+          <w:rFonts w:ascii="Times  New Roman" w:hAnsi="Times  New Roman"/>
+          <w:sz w:val="26"/>
+          <w:szCs w:val="26"/>
+          <w:lang w:val="vi-VN"/>
+        </w:rPr>
+      </w:pPr>
+      <w:r>
+        <w:rPr>
+          <w:rFonts w:ascii="Times  New Roman" w:hAnsi="Times  New Roman"/>
+          <w:color w:val="EE0000"/>
+          <w:sz w:val="26"/>
+          <w:szCs w:val="26"/>
+          <w:highlight w:val="yellow"/>
         </w:rPr>
         <w:lastRenderedPageBreak/>
+        <w:t>M</w:t>
+      </w:r>
+      <w:r>
+        <w:rPr>
+          <w:rFonts w:ascii="Times  New Roman" w:hAnsi="Times  New Roman"/>
+          <w:color w:val="EE0000"/>
+          <w:sz w:val="26"/>
+          <w:szCs w:val="26"/>
+          <w:highlight w:val="yellow"/>
+        </w:rPr>
+        <w:t xml:space="preserve">odel-based reflex </w:t>
+      </w:r>
+      <w:r>
+        <w:rPr>
+          <w:rFonts w:ascii="Times  New Roman" w:hAnsi="Times  New Roman"/>
+          <w:color w:val="EE0000"/>
+          <w:sz w:val="26"/>
+          <w:szCs w:val="26"/>
+          <w:highlight w:val="yellow"/>
+        </w:rPr>
+        <w:t>agent</w:t>
+      </w:r>
+      <w:r>
+        <w:rPr>
+          <w:rFonts w:ascii="Times  New Roman" w:hAnsi="Times  New Roman"/>
+          <w:color w:val="EE0000"/>
+          <w:sz w:val="26"/>
+          <w:szCs w:val="26"/>
+          <w:highlight w:val="yellow"/>
+          <w:lang w:val="vi-VN"/>
+        </w:rPr>
+        <w:t xml:space="preserve">: </w:t>
+      </w:r>
+      <w:r>
+        <w:rPr>
+          <w:rFonts w:ascii="Times  New Roman" w:hAnsi="Times  New Roman"/>
+          <w:sz w:val="26"/>
+          <w:szCs w:val="26"/>
+        </w:rPr>
+        <w:t xml:space="preserve">Nó duy trì một "trạng thái nội bộ" (internal state) để theo dõi những phần của môi trường mà hiện tại nó không thể nhìn thấy, dựa trên lịch sử nhận thức. Nó cần một </w:t>
+      </w:r>
+      <w:r>
+        <w:rPr>
+          <w:rFonts w:ascii="Times  New Roman" w:hAnsi="Times  New Roman"/>
+          <w:i/>
+          <w:iCs/>
+          <w:sz w:val="26"/>
+          <w:szCs w:val="26"/>
+        </w:rPr>
+        <w:t>mô hình</w:t>
+      </w:r>
+      <w:r>
+        <w:rPr>
+          <w:rFonts w:ascii="Times  New Roman" w:hAnsi="Times  New Roman"/>
+          <w:sz w:val="26"/>
+          <w:szCs w:val="26"/>
+        </w:rPr>
+        <w:t xml:space="preserve"> về cách thế giới tiến hóa và cách các hành động của nó ảnh hưởng đến thế giới.</w:t>
+      </w:r>
+      <w:r>
+        <w:rPr>
+          <w:rFonts w:ascii="Times  New Roman" w:hAnsi="Times  New Roman"/>
+          <w:sz w:val="26"/>
+          <w:szCs w:val="26"/>
+          <w:lang w:val="vi-VN"/>
+        </w:rPr>
+        <w:t xml:space="preserve"> </w:t>
+      </w:r>
+      <w:r>
+        <w:rPr>
+          <w:rFonts w:ascii="Times  New Roman" w:hAnsi="Times  New Roman"/>
+          <w:sz w:val="26"/>
+          <w:szCs w:val="26"/>
+        </w:rPr>
+        <w:t>C</w:t>
+      </w:r>
+      <w:r>
+        <w:rPr>
+          <w:rFonts w:ascii="Times  New Roman" w:hAnsi="Times  New Roman"/>
+          <w:sz w:val="26"/>
+          <w:szCs w:val="26"/>
+        </w:rPr>
+        <w:t>ó thể hoạt động trong môi trường chỉ quan sát được một phần (partially observable).</w:t>
+      </w:r>
+      <w:r>
+        <w:rPr>
+          <w:rFonts w:ascii="Times  New Roman" w:hAnsi="Times  New Roman"/>
+          <w:sz w:val="26"/>
+          <w:szCs w:val="26"/>
+          <w:lang w:val="vi-VN"/>
+        </w:rPr>
+        <w:t xml:space="preserve"> </w:t>
+      </w:r>
+      <w:r>
+        <w:rPr>
+          <w:rFonts w:ascii="Times  New Roman" w:hAnsi="Times  New Roman"/>
+          <w:sz w:val="26"/>
+          <w:szCs w:val="26"/>
+          <w:highlight w:val="yellow"/>
+          <w:lang w:val="vi-VN"/>
+        </w:rPr>
+        <w:t xml:space="preserve">Hoạt động dựa trên 1 phần kí ức của quá khứ và 1 phần của hiện </w:t>
+      </w:r>
+      <w:r>
+        <w:rPr>
+          <w:rFonts w:ascii="Times  New Roman" w:hAnsi="Times  New Roman"/>
+          <w:sz w:val="26"/>
+          <w:szCs w:val="26"/>
+          <w:highlight w:val="yellow"/>
+          <w:lang w:val="vi-VN"/>
+        </w:rPr>
+        <w:t>tại</w:t>
+      </w:r>
+      <w:r>
+        <w:rPr>
+          <w:rFonts w:ascii="Times  New Roman" w:hAnsi="Times  New Roman"/>
+          <w:sz w:val="26"/>
+          <w:szCs w:val="26"/>
+          <w:lang w:val="vi-VN"/>
+        </w:rPr>
+        <w:t xml:space="preserve">, </w:t>
+      </w:r>
+      <w:r>
+        <w:rPr>
+          <w:rFonts w:ascii="Times  New Roman" w:hAnsi="Times  New Roman"/>
+          <w:sz w:val="26"/>
+          <w:szCs w:val="26"/>
+          <w:highlight w:val="yellow"/>
+          <w:lang w:val="vi-VN"/>
+        </w:rPr>
+        <w:t>tiếp</w:t>
+      </w:r>
+      <w:r>
+        <w:rPr>
+          <w:rFonts w:ascii="Times  New Roman" w:hAnsi="Times  New Roman"/>
+          <w:sz w:val="26"/>
+          <w:szCs w:val="26"/>
+          <w:lang w:val="vi-VN"/>
+        </w:rPr>
+        <w:t xml:space="preserve"> </w:t>
+      </w:r>
+      <w:r>
+        <w:rPr>
+          <w:rFonts w:ascii="Times  New Roman" w:hAnsi="Times  New Roman"/>
+          <w:sz w:val="26"/>
+          <w:szCs w:val="26"/>
+          <w:highlight w:val="yellow"/>
+          <w:lang w:val="vi-VN"/>
+        </w:rPr>
+        <w:t>nhận</w:t>
+      </w:r>
+      <w:r>
+        <w:rPr>
+          <w:rFonts w:ascii="Times  New Roman" w:hAnsi="Times  New Roman"/>
+          <w:sz w:val="26"/>
+          <w:szCs w:val="26"/>
+          <w:lang w:val="vi-VN"/>
+        </w:rPr>
+        <w:t xml:space="preserve"> </w:t>
+      </w:r>
+      <w:r>
+        <w:rPr>
+          <w:rFonts w:ascii="Times  New Roman" w:hAnsi="Times  New Roman"/>
+          <w:sz w:val="26"/>
+          <w:szCs w:val="26"/>
+          <w:highlight w:val="yellow"/>
+          <w:lang w:val="vi-VN"/>
+        </w:rPr>
+        <w:t>thông</w:t>
+      </w:r>
+      <w:r>
+        <w:rPr>
+          <w:rFonts w:ascii="Times  New Roman" w:hAnsi="Times  New Roman"/>
+          <w:sz w:val="26"/>
+          <w:szCs w:val="26"/>
+          <w:lang w:val="vi-VN"/>
+        </w:rPr>
+        <w:t xml:space="preserve"> </w:t>
+      </w:r>
+      <w:r>
+        <w:rPr>
+          <w:rFonts w:ascii="Times  New Roman" w:hAnsi="Times  New Roman"/>
+          <w:sz w:val="26"/>
+          <w:szCs w:val="26"/>
+          <w:highlight w:val="yellow"/>
+          <w:lang w:val="vi-VN"/>
+        </w:rPr>
+        <w:t>tin</w:t>
+      </w:r>
+      <w:r>
+        <w:rPr>
+          <w:rFonts w:ascii="Times  New Roman" w:hAnsi="Times  New Roman"/>
+          <w:sz w:val="26"/>
+          <w:szCs w:val="26"/>
+          <w:lang w:val="vi-VN"/>
+        </w:rPr>
+        <w:t xml:space="preserve">-&gt; </w:t>
+      </w:r>
+      <w:r>
+        <w:rPr>
+          <w:rFonts w:ascii="Times  New Roman" w:hAnsi="Times  New Roman"/>
+          <w:sz w:val="26"/>
+          <w:szCs w:val="26"/>
+          <w:highlight w:val="yellow"/>
+          <w:lang w:val="vi-VN"/>
+        </w:rPr>
+        <w:t>suy</w:t>
+      </w:r>
+      <w:r>
+        <w:rPr>
+          <w:rFonts w:ascii="Times  New Roman" w:hAnsi="Times  New Roman"/>
+          <w:sz w:val="26"/>
+          <w:szCs w:val="26"/>
+          <w:lang w:val="vi-VN"/>
+        </w:rPr>
+        <w:t xml:space="preserve"> </w:t>
+      </w:r>
+      <w:r>
+        <w:rPr>
+          <w:rFonts w:ascii="Times  New Roman" w:hAnsi="Times  New Roman"/>
+          <w:sz w:val="26"/>
+          <w:szCs w:val="26"/>
+          <w:highlight w:val="yellow"/>
+          <w:lang w:val="vi-VN"/>
+        </w:rPr>
+        <w:t>nghĩ</w:t>
+      </w:r>
+      <w:r>
+        <w:rPr>
+          <w:rFonts w:ascii="Times  New Roman" w:hAnsi="Times  New Roman"/>
+          <w:sz w:val="26"/>
+          <w:szCs w:val="26"/>
+          <w:lang w:val="vi-VN"/>
+        </w:rPr>
+        <w:t xml:space="preserve"> -&gt; </w:t>
+      </w:r>
+      <w:r>
+        <w:rPr>
+          <w:rFonts w:ascii="Times  New Roman" w:hAnsi="Times  New Roman"/>
+          <w:sz w:val="26"/>
+          <w:szCs w:val="26"/>
+          <w:highlight w:val="yellow"/>
+          <w:lang w:val="vi-VN"/>
+        </w:rPr>
+        <w:t>hành</w:t>
+      </w:r>
+      <w:r>
+        <w:rPr>
+          <w:rFonts w:ascii="Times  New Roman" w:hAnsi="Times  New Roman"/>
+          <w:sz w:val="26"/>
+          <w:szCs w:val="26"/>
+          <w:lang w:val="vi-VN"/>
+        </w:rPr>
+        <w:t xml:space="preserve"> </w:t>
+      </w:r>
+      <w:r>
+        <w:rPr>
+          <w:rFonts w:ascii="Times  New Roman" w:hAnsi="Times  New Roman"/>
+          <w:sz w:val="26"/>
+          <w:szCs w:val="26"/>
+          <w:highlight w:val="yellow"/>
+          <w:lang w:val="vi-VN"/>
+        </w:rPr>
+        <w:t>động</w:t>
+      </w:r>
+    </w:p>
+    <w:p>
+      <w:pPr>
+        <w:rPr>
+          <w:rFonts w:ascii="Times  New Roman" w:hAnsi="Times  New Roman"/>
+          <w:sz w:val="26"/>
+          <w:szCs w:val="26"/>
+          <w:lang w:val="vi-VN"/>
+        </w:rPr>
+      </w:pPr>
+      <w:r>
+        <w:rPr>
+          <w:rFonts w:ascii="Times  New Roman" w:hAnsi="Times  New Roman"/>
+          <w:sz w:val="26"/>
+          <w:szCs w:val="26"/>
+          <w:lang w:val="vi-VN"/>
+        </w:rPr>
+        <w:t>function MODEL_BASED_REFLECT_AGENT(percept) return action</w:t>
+      </w:r>
+    </w:p>
+    <w:p>
+      <w:pPr>
+        <w:rPr>
+          <w:rFonts w:ascii="Times  New Roman" w:hAnsi="Times  New Roman"/>
+          <w:sz w:val="26"/>
+          <w:szCs w:val="26"/>
+          <w:lang w:val="vi-VN"/>
+        </w:rPr>
+      </w:pPr>
+      <w:r>
+        <w:rPr>
+          <w:rFonts w:ascii="Times  New Roman" w:hAnsi="Times  New Roman"/>
+          <w:sz w:val="26"/>
+          <w:szCs w:val="26"/>
+          <w:lang w:val="vi-VN"/>
+        </w:rPr>
+        <w:t>persistent:</w:t>
+      </w:r>
+    </w:p>
+    <w:p>
+      <w:pPr>
+        <w:rPr>
+          <w:rFonts w:ascii="Times  New Roman" w:hAnsi="Times  New Roman"/>
+          <w:sz w:val="26"/>
+          <w:szCs w:val="26"/>
+          <w:lang w:val="vi-VN"/>
+        </w:rPr>
+      </w:pPr>
+      <w:r>
+        <w:rPr>
+          <w:rFonts w:ascii="Times  New Roman" w:hAnsi="Times  New Roman"/>
+          <w:sz w:val="26"/>
+          <w:szCs w:val="26"/>
+          <w:lang w:val="vi-VN"/>
+        </w:rPr>
+        <w:tab/>
+        <w:t>state //trạng thái hiện tại của môi trường</w:t>
+      </w:r>
+    </w:p>
+    <w:p>
+      <w:pPr>
+        <w:rPr>
+          <w:rFonts w:ascii="Times  New Roman" w:hAnsi="Times  New Roman"/>
+          <w:sz w:val="26"/>
+          <w:szCs w:val="26"/>
+          <w:lang w:val="vi-VN"/>
+        </w:rPr>
+      </w:pPr>
+      <w:r>
+        <w:rPr>
+          <w:rFonts w:ascii="Times  New Roman" w:hAnsi="Times  New Roman"/>
+          <w:sz w:val="26"/>
+          <w:szCs w:val="26"/>
+          <w:lang w:val="vi-VN"/>
+        </w:rPr>
+        <w:tab/>
+        <w:t>model // mô hình dự đoán hành động</w:t>
+      </w:r>
+    </w:p>
+    <w:p>
+      <w:pPr>
+        <w:rPr>
+          <w:rFonts w:ascii="Times  New Roman" w:hAnsi="Times  New Roman"/>
+          <w:sz w:val="26"/>
+          <w:szCs w:val="26"/>
+          <w:lang w:val="vi-VN"/>
+        </w:rPr>
+      </w:pPr>
+      <w:r>
+        <w:rPr>
+          <w:rFonts w:ascii="Times  New Roman" w:hAnsi="Times  New Roman"/>
+          <w:sz w:val="26"/>
+          <w:szCs w:val="26"/>
+          <w:lang w:val="vi-VN"/>
+        </w:rPr>
+        <w:tab/>
+        <w:t>rules // tập luật điều kiện – hành động</w:t>
+      </w:r>
+    </w:p>
+    <w:p>
+      <w:pPr>
+        <w:rPr>
+          <w:rFonts w:ascii="Times  New Roman" w:hAnsi="Times  New Roman"/>
+          <w:sz w:val="26"/>
+          <w:szCs w:val="26"/>
+          <w:lang w:val="vi-VN"/>
+        </w:rPr>
+      </w:pPr>
+      <w:r>
+        <w:rPr>
+          <w:rFonts w:ascii="Times  New Roman" w:hAnsi="Times  New Roman"/>
+          <w:sz w:val="26"/>
+          <w:szCs w:val="26"/>
+          <w:lang w:val="vi-VN"/>
+        </w:rPr>
+        <w:tab/>
+        <w:t>action // hành động trước đó</w:t>
+      </w:r>
+    </w:p>
+    <w:p>
+      <w:pPr>
+        <w:rPr>
+          <w:rFonts w:ascii="Times  New Roman" w:hAnsi="Times  New Roman"/>
+          <w:sz w:val="26"/>
+          <w:szCs w:val="26"/>
+          <w:lang w:val="vi-VN"/>
+        </w:rPr>
+      </w:pPr>
+      <w:r>
+        <w:rPr>
+          <w:rFonts w:ascii="Times  New Roman" w:hAnsi="Times  New Roman"/>
+          <w:sz w:val="26"/>
+          <w:szCs w:val="26"/>
+          <w:lang w:val="vi-VN"/>
+        </w:rPr>
+        <w:t xml:space="preserve">state &lt;- UPDATE_STATE (state, </w:t>
+      </w:r>
+      <w:r>
+        <w:rPr>
+          <w:rFonts w:ascii="Times  New Roman" w:hAnsi="Times  New Roman"/>
+          <w:sz w:val="26"/>
+          <w:szCs w:val="26"/>
+          <w:lang w:val="vi-VN"/>
+        </w:rPr>
+        <w:t>action(trạng thái và hd trong qkhu)</w:t>
+      </w:r>
+      <w:r>
+        <w:rPr>
+          <w:rFonts w:ascii="Times  New Roman" w:hAnsi="Times  New Roman"/>
+          <w:sz w:val="26"/>
+          <w:szCs w:val="26"/>
+          <w:lang w:val="vi-VN"/>
+        </w:rPr>
+        <w:t xml:space="preserve">, </w:t>
+      </w:r>
+      <w:r>
+        <w:rPr>
+          <w:rFonts w:ascii="Times  New Roman" w:hAnsi="Times  New Roman"/>
+          <w:sz w:val="26"/>
+          <w:szCs w:val="26"/>
+          <w:lang w:val="vi-VN"/>
+        </w:rPr>
+        <w:t>percept(trạng thái hiện tại)</w:t>
+      </w:r>
+      <w:r>
+        <w:rPr>
+          <w:rFonts w:ascii="Times  New Roman" w:hAnsi="Times  New Roman"/>
+          <w:sz w:val="26"/>
+          <w:szCs w:val="26"/>
+          <w:lang w:val="vi-VN"/>
+        </w:rPr>
+        <w:t xml:space="preserve">, </w:t>
+      </w:r>
+      <w:r>
+        <w:rPr>
+          <w:rFonts w:ascii="Times  New Roman" w:hAnsi="Times  New Roman"/>
+          <w:sz w:val="26"/>
+          <w:szCs w:val="26"/>
+          <w:lang w:val="vi-VN"/>
+        </w:rPr>
+        <w:t>model(</w:t>
+      </w:r>
+      <w:r>
+        <w:rPr>
+          <w:rFonts w:ascii="Times  New Roman" w:hAnsi="Times  New Roman"/>
+          <w:sz w:val="26"/>
+          <w:szCs w:val="26"/>
+          <w:lang w:val="vi-VN"/>
+        </w:rPr>
+        <w:t xml:space="preserve">vị trí ô trống kèm theo </w:t>
+      </w:r>
+      <w:r>
+        <w:rPr>
+          <w:rFonts w:ascii="Times  New Roman" w:hAnsi="Times  New Roman"/>
+          <w:sz w:val="26"/>
+          <w:szCs w:val="26"/>
+          <w:lang w:val="vi-VN"/>
+        </w:rPr>
+        <w:t>hành động đừng nên thực hiện)</w:t>
+      </w:r>
+      <w:r>
+        <w:rPr>
+          <w:rFonts w:ascii="Times  New Roman" w:hAnsi="Times  New Roman"/>
+          <w:sz w:val="26"/>
+          <w:szCs w:val="26"/>
+          <w:lang w:val="vi-VN"/>
+        </w:rPr>
+        <w:t>)</w:t>
+      </w:r>
+    </w:p>
+    <w:p>
+      <w:pPr>
+        <w:rPr>
+          <w:rFonts w:ascii="Times  New Roman" w:hAnsi="Times  New Roman"/>
+          <w:sz w:val="26"/>
+          <w:szCs w:val="26"/>
+          <w:lang w:val="vi-VN"/>
+        </w:rPr>
+      </w:pPr>
+      <w:r>
+        <w:rPr>
+          <w:rFonts w:ascii="Times  New Roman" w:hAnsi="Times  New Roman"/>
+          <w:sz w:val="26"/>
+          <w:szCs w:val="26"/>
+          <w:lang w:val="vi-VN"/>
+        </w:rPr>
+        <w:t>rule &lt;- RULE_MATCH (state, rules)</w:t>
+      </w:r>
+    </w:p>
+    <w:p>
+      <w:pPr>
+        <w:rPr>
+          <w:rFonts w:ascii="Times  New Roman" w:hAnsi="Times  New Roman"/>
+          <w:sz w:val="26"/>
+          <w:szCs w:val="26"/>
+          <w:lang w:val="vi-VN"/>
+        </w:rPr>
+      </w:pPr>
+      <w:r>
+        <w:rPr>
+          <w:rFonts w:ascii="Times  New Roman" w:hAnsi="Times  New Roman"/>
+          <w:sz w:val="26"/>
+          <w:szCs w:val="26"/>
+          <w:lang w:val="vi-VN"/>
+        </w:rPr>
         <w:t>action &lt;- rule.ACTION</w:t>
       </w:r>
     </w:p>
     <w:p>
       <w:pPr>
-        <w:ind w:firstLine="720"/>
-        <w:rPr>
-          <w:rFonts w:ascii="Times  New Roman" w:hAnsi="Times  New Roman"/>
-          <w:sz w:val="26"/>
-          <w:szCs w:val="26"/>
+        <w:rPr>
+          <w:rFonts w:ascii="Times  New Roman" w:hAnsi="Times  New Roman"/>
+          <w:sz w:val="26"/>
+          <w:szCs w:val="26"/>
+          <w:highlight w:val="yellow"/>
           <w:lang w:val="vi-VN"/>
         </w:rPr>
       </w:pPr>
@@ -1575,75 +2097,292 @@
       <w:pPr>
         <w:rPr>
           <w:rFonts w:ascii="Times  New Roman" w:hAnsi="Times  New Roman"/>
-          <w:sz w:val="26"/>
-          <w:szCs w:val="26"/>
-          <w:lang w:val="vi-VN"/>
-        </w:rPr>
-      </w:pPr>
-    </w:p>
-    <w:p>
-      <w:pPr>
-        <w:rPr>
-          <w:rFonts w:ascii="Times  New Roman" w:hAnsi="Times  New Roman"/>
-          <w:sz w:val="26"/>
-          <w:szCs w:val="26"/>
-        </w:rPr>
-      </w:pPr>
-      <w:r>
-        <w:rPr>
-          <w:rFonts w:ascii="Times  New Roman" w:hAnsi="Times  New Roman"/>
-          <w:sz w:val="26"/>
-          <w:szCs w:val="26"/>
-        </w:rPr>
-        <w:t>model-based reflex agent</w:t>
-      </w:r>
-    </w:p>
-    <w:p>
-      <w:pPr>
-        <w:rPr>
-          <w:rFonts w:ascii="Times  New Roman" w:hAnsi="Times  New Roman"/>
-          <w:sz w:val="26"/>
-          <w:szCs w:val="26"/>
-          <w:lang w:val="vi-VN"/>
-        </w:rPr>
-      </w:pPr>
-      <w:r>
-        <w:rPr>
-          <w:rFonts w:ascii="Times  New Roman" w:hAnsi="Times  New Roman"/>
-          <w:sz w:val="26"/>
-          <w:szCs w:val="26"/>
-        </w:rPr>
-        <w:t>goal-based agent</w:t>
-      </w:r>
-    </w:p>
-    <w:p>
-      <w:pPr>
-        <w:rPr>
-          <w:rFonts w:ascii="Times  New Roman" w:hAnsi="Times  New Roman"/>
-          <w:sz w:val="26"/>
-          <w:szCs w:val="26"/>
-          <w:lang w:val="vi-VN"/>
-        </w:rPr>
-      </w:pPr>
-      <w:r>
-        <w:rPr>
-          <w:rFonts w:ascii="Times  New Roman" w:hAnsi="Times  New Roman"/>
-          <w:sz w:val="26"/>
-          <w:szCs w:val="26"/>
-          <w:lang w:val="vi-VN"/>
-        </w:rPr>
-        <w:t>ultility</w:t>
-      </w:r>
-    </w:p>
-    <w:p>
-      <w:pPr>
-        <w:rPr>
-          <w:rFonts w:ascii="Times  New Roman" w:hAnsi="Times  New Roman"/>
-          <w:sz w:val="26"/>
-          <w:szCs w:val="26"/>
-          <w:lang w:val="vi-VN"/>
-        </w:rPr>
-      </w:pPr>
+          <w:color w:val="EE0000"/>
+          <w:sz w:val="26"/>
+          <w:szCs w:val="26"/>
+          <w:highlight w:val="yellow"/>
+          <w:lang w:val="vi-VN"/>
+        </w:rPr>
+      </w:pPr>
+      <w:r>
+        <w:rPr>
+          <w:rFonts w:ascii="Times  New Roman" w:hAnsi="Times  New Roman"/>
+          <w:color w:val="EE0000"/>
+          <w:sz w:val="26"/>
+          <w:szCs w:val="26"/>
+          <w:highlight w:val="yellow"/>
+        </w:rPr>
+        <w:t>G</w:t>
+      </w:r>
+      <w:r>
+        <w:rPr>
+          <w:rFonts w:ascii="Times  New Roman" w:hAnsi="Times  New Roman"/>
+          <w:color w:val="EE0000"/>
+          <w:sz w:val="26"/>
+          <w:szCs w:val="26"/>
+          <w:highlight w:val="yellow"/>
+        </w:rPr>
+        <w:t>oal-based agent</w:t>
+      </w:r>
+    </w:p>
+    <w:p>
+      <w:pPr>
+        <w:rPr>
+          <w:rFonts w:ascii="Times  New Roman" w:hAnsi="Times  New Roman"/>
+          <w:color w:val="EE0000"/>
+          <w:sz w:val="26"/>
+          <w:szCs w:val="26"/>
+          <w:highlight w:val="yellow"/>
+          <w:lang w:val="vi-VN"/>
+        </w:rPr>
+      </w:pPr>
+      <w:r>
+        <w:rPr>
+          <w:rFonts w:ascii="Times  New Roman" w:hAnsi="Times  New Roman"/>
+          <w:color w:val="EE0000"/>
+          <w:sz w:val="26"/>
+          <w:szCs w:val="26"/>
+          <w:highlight w:val="yellow"/>
+          <w:lang w:val="vi-VN"/>
+        </w:rPr>
+        <w:t>Utility-based agent</w:t>
+      </w:r>
+    </w:p>
+    <w:p>
+      <w:pPr>
+        <w:rPr>
+          <w:rFonts w:ascii="Times  New Roman" w:hAnsi="Times  New Roman"/>
+          <w:color w:val="EE0000"/>
+          <w:sz w:val="26"/>
+          <w:szCs w:val="26"/>
+          <w:lang w:val="vi-VN"/>
+        </w:rPr>
+      </w:pPr>
+      <w:r>
+        <w:rPr>
+          <w:rFonts w:ascii="Times  New Roman" w:hAnsi="Times  New Roman"/>
+          <w:color w:val="EE0000"/>
+          <w:sz w:val="26"/>
+          <w:szCs w:val="26"/>
+          <w:highlight w:val="yellow"/>
+          <w:lang w:val="vi-VN"/>
+        </w:rPr>
+        <w:t xml:space="preserve">Learning </w:t>
+      </w:r>
+      <w:r>
+        <w:rPr>
+          <w:rFonts w:ascii="Times  New Roman" w:hAnsi="Times  New Roman"/>
+          <w:color w:val="EE0000"/>
+          <w:sz w:val="26"/>
+          <w:szCs w:val="26"/>
+          <w:highlight w:val="yellow"/>
+          <w:lang w:val="vi-VN"/>
+        </w:rPr>
+        <w:t>agent</w:t>
+      </w:r>
+    </w:p>
+    <w:p>
+      <w:pPr>
+        <w:rPr>
+          <w:rFonts w:ascii="Times  New Roman" w:hAnsi="Times  New Roman"/>
+          <w:color w:val="EE0000"/>
+          <w:sz w:val="26"/>
+          <w:szCs w:val="26"/>
+          <w:lang w:val="vi-VN"/>
+        </w:rPr>
+      </w:pPr>
+    </w:p>
+    <w:p>
+      <w:pPr>
+        <w:rPr>
+          <w:rFonts w:ascii="Times  New Roman" w:hAnsi="Times  New Roman"/>
+          <w:color w:val="EE0000"/>
+          <w:sz w:val="26"/>
+          <w:szCs w:val="26"/>
+          <w:lang w:val="vi-VN"/>
+        </w:rPr>
+      </w:pPr>
+    </w:p>
+    <w:p>
+      <w:pPr>
+        <w:rPr>
+          <w:rFonts w:ascii="Times  New Roman" w:hAnsi="Times  New Roman"/>
+          <w:color w:val="EE0000"/>
+          <w:sz w:val="26"/>
+          <w:szCs w:val="26"/>
+          <w:lang w:val="vi-VN"/>
+        </w:rPr>
+      </w:pPr>
+    </w:p>
+    <w:p>
+      <w:pPr>
+        <w:rPr>
+          <w:rFonts w:ascii="Times  New Roman" w:hAnsi="Times  New Roman"/>
+          <w:color w:val="EE0000"/>
+          <w:sz w:val="26"/>
+          <w:szCs w:val="26"/>
+          <w:lang w:val="vi-VN"/>
+        </w:rPr>
+      </w:pPr>
+    </w:p>
+    <w:p>
+      <w:pPr>
+        <w:rPr>
+          <w:rFonts w:ascii="Times  New Roman" w:hAnsi="Times  New Roman"/>
+          <w:color w:val="EE0000"/>
+          <w:sz w:val="26"/>
+          <w:szCs w:val="26"/>
+          <w:lang w:val="vi-VN"/>
+        </w:rPr>
+      </w:pPr>
+    </w:p>
+    <w:p>
+      <w:pPr>
+        <w:rPr>
+          <w:rFonts w:ascii="Times  New Roman" w:hAnsi="Times  New Roman"/>
+          <w:color w:val="EE0000"/>
+          <w:sz w:val="26"/>
+          <w:szCs w:val="26"/>
+          <w:lang w:val="vi-VN"/>
+        </w:rPr>
+      </w:pPr>
+    </w:p>
+    <w:p>
+      <w:pPr>
+        <w:rPr>
+          <w:rFonts w:ascii="Times  New Roman" w:hAnsi="Times  New Roman"/>
+          <w:color w:val="EE0000"/>
+          <w:sz w:val="26"/>
+          <w:szCs w:val="26"/>
+          <w:lang w:val="vi-VN"/>
+        </w:rPr>
+      </w:pPr>
+    </w:p>
+    <w:p>
+      <w:pPr>
+        <w:jc w:val="center"/>
+        <w:rPr>
+          <w:rFonts w:ascii="Times  New Roman" w:hAnsi="Times  New Roman"/>
+          <w:sz w:val="26"/>
+          <w:szCs w:val="26"/>
+          <w:lang w:val="vi-VN"/>
+        </w:rPr>
+      </w:pPr>
+      <w:r>
+        <w:rPr>
+          <w:rFonts w:ascii="Times  New Roman" w:hAnsi="Times  New Roman"/>
+          <w:sz w:val="26"/>
+          <w:szCs w:val="26"/>
+          <w:lang w:val="vi-VN"/>
+        </w:rPr>
+        <w:lastRenderedPageBreak/>
+        <w:t>CÁC THUẬT TOÁN TÌM KIẾM</w:t>
+      </w:r>
+    </w:p>
+    <w:p>
+      <w:pPr>
+        <w:rPr>
+          <w:rFonts w:ascii="Times  New Roman" w:hAnsi="Times  New Roman"/>
+          <w:sz w:val="26"/>
+          <w:szCs w:val="26"/>
+          <w:lang w:val="vi-VN"/>
+        </w:rPr>
+      </w:pPr>
+      <w:r>
+        <w:rPr>
+          <w:rFonts w:ascii="Times  New Roman" w:hAnsi="Times  New Roman"/>
+          <w:sz w:val="26"/>
+          <w:szCs w:val="26"/>
+          <w:lang w:val="vi-VN"/>
+        </w:rPr>
+        <w:t>- Đầu vào: trạng thái ban đầu, trạng thái mục tiêu, các hành động có thể có, không gian trạng thái(tập hợp tất cả các trạng thái mà môi trường có thể có, trạng thái là thông tin của môi trường có thể có tại 1 thời điểm)</w:t>
+      </w:r>
+    </w:p>
+    <w:p>
+      <w:pPr>
+        <w:rPr>
+          <w:rFonts w:ascii="Times  New Roman" w:hAnsi="Times  New Roman"/>
+          <w:sz w:val="26"/>
+          <w:szCs w:val="26"/>
+          <w:lang w:val="vi-VN"/>
+        </w:rPr>
+      </w:pPr>
+      <w:r>
+        <w:rPr>
+          <w:rFonts w:ascii="Times  New Roman" w:hAnsi="Times  New Roman"/>
+          <w:sz w:val="26"/>
+          <w:szCs w:val="26"/>
+          <w:lang w:val="vi-VN"/>
+        </w:rPr>
+        <w:t>- Đầu ra: một chuỗi hoạt động hoặc đường đi từ trạng thái đầu đến trạng thái đích(một vấn đề tìm kiếm)</w:t>
+      </w:r>
+    </w:p>
+    <w:p>
+      <w:pPr>
+        <w:rPr>
+          <w:rFonts w:ascii="Times  New Roman" w:hAnsi="Times  New Roman"/>
+          <w:sz w:val="26"/>
+          <w:szCs w:val="26"/>
+          <w:lang w:val="vi-VN"/>
+        </w:rPr>
+      </w:pPr>
+      <w:r>
+        <w:rPr>
+          <w:rFonts w:ascii="Times  New Roman" w:hAnsi="Times  New Roman"/>
+          <w:sz w:val="26"/>
+          <w:szCs w:val="26"/>
+          <w:lang w:val="vi-VN"/>
+        </w:rPr>
+        <w:t>- Trạng thái mt thay đổi khi mà agent thực hiện xong 1 hd</w:t>
+      </w:r>
+    </w:p>
+    <w:p>
+      <w:pPr>
+        <w:rPr>
+          <w:rFonts w:ascii="Times  New Roman" w:hAnsi="Times  New Roman"/>
+          <w:sz w:val="26"/>
+          <w:szCs w:val="26"/>
+          <w:lang w:val="vi-VN"/>
+        </w:rPr>
+      </w:pPr>
+      <w:r>
+        <w:rPr>
+          <w:rFonts w:ascii="Times  New Roman" w:hAnsi="Times  New Roman"/>
+          <w:color w:val="EE0000"/>
+          <w:sz w:val="26"/>
+          <w:szCs w:val="26"/>
+          <w:lang w:val="vi-VN"/>
+        </w:rPr>
+        <w:t>*BFS</w:t>
+      </w:r>
+      <w:r>
+        <w:rPr>
+          <w:rFonts w:ascii="Times  New Roman" w:hAnsi="Times  New Roman"/>
+          <w:sz w:val="26"/>
+          <w:szCs w:val="26"/>
+          <w:lang w:val="vi-VN"/>
+        </w:rPr>
+        <w:t>(tìm kiếm không có thông tin bổ sung (không có hàm đánh giá), thông qua không gian trạng thái tìm kiếm trong tập các khả năng) hay còn gọi là thuật toán tìm kiếm mù</w:t>
+      </w:r>
+    </w:p>
+    <w:p>
+      <w:pPr>
+        <w:rPr>
+          <w:rFonts w:ascii="Times  New Roman" w:hAnsi="Times  New Roman"/>
+          <w:sz w:val="26"/>
+          <w:szCs w:val="26"/>
+          <w:lang w:val="vi-VN"/>
+        </w:rPr>
+      </w:pPr>
+      <w:r>
+        <w:rPr>
+          <w:rFonts w:ascii="Times  New Roman" w:hAnsi="Times  New Roman"/>
+          <w:sz w:val="26"/>
+          <w:szCs w:val="26"/>
+          <w:lang w:val="vi-VN"/>
+        </w:rPr>
+        <w:t>- BFS khám phá các nút trong cùng 1 level trước rồi mới xuống level tiếp theo. Dùng queue (FIFO), dạng ống</w:t>
+      </w:r>
     </w:p>
     <w:p>
       <w:pPr>

</xml_diff>

<commit_message>
Cập nhật file BT
</commit_message>
<xml_diff>
--- a/Lý thuyết.docx
+++ b/Lý thuyết.docx
@@ -2381,27 +2381,213 @@
           <w:szCs w:val="26"/>
           <w:lang w:val="vi-VN"/>
         </w:rPr>
-        <w:t>- BFS khám phá các nút trong cùng 1 level trước rồi mới xuống level tiếp theo. Dùng queue (FIFO), dạng ống</w:t>
-      </w:r>
-    </w:p>
-    <w:p>
-      <w:pPr>
-        <w:rPr>
-          <w:rFonts w:ascii="Times  New Roman" w:hAnsi="Times  New Roman"/>
-          <w:sz w:val="26"/>
-          <w:szCs w:val="26"/>
-        </w:rPr>
-      </w:pPr>
-    </w:p>
-    <w:p>
-      <w:pPr>
-        <w:rPr>
-          <w:rFonts w:ascii="Times  New Roman" w:hAnsi="Times  New Roman"/>
-          <w:sz w:val="26"/>
-          <w:szCs w:val="26"/>
-          <w:lang w:val="vi-VN"/>
-        </w:rPr>
-      </w:pPr>
+        <w:t xml:space="preserve">- BFS khám phá các nút trong cùng 1 level trước rồi mới xuống level tiếp theo. </w:t>
+      </w:r>
+      <w:r>
+        <w:rPr>
+          <w:rFonts w:ascii="Times  New Roman" w:hAnsi="Times  New Roman"/>
+          <w:sz w:val="26"/>
+          <w:szCs w:val="26"/>
+          <w:lang w:val="vi-VN"/>
+        </w:rPr>
+        <w:t>CẤU TRÚC LƯU TRỮ GẮN VỚI</w:t>
+      </w:r>
+      <w:r>
+        <w:rPr>
+          <w:rFonts w:ascii="Times  New Roman" w:hAnsi="Times  New Roman"/>
+          <w:sz w:val="26"/>
+          <w:szCs w:val="26"/>
+          <w:lang w:val="vi-VN"/>
+        </w:rPr>
+        <w:t xml:space="preserve"> queue (FIFO), dạng </w:t>
+      </w:r>
+      <w:r>
+        <w:rPr>
+          <w:rFonts w:ascii="Times  New Roman" w:hAnsi="Times  New Roman"/>
+          <w:sz w:val="26"/>
+          <w:szCs w:val="26"/>
+          <w:lang w:val="vi-VN"/>
+        </w:rPr>
+        <w:t>ống</w:t>
+      </w:r>
+    </w:p>
+    <w:p>
+      <w:pPr>
+        <w:rPr>
+          <w:rFonts w:ascii="Times  New Roman" w:hAnsi="Times  New Roman"/>
+          <w:sz w:val="26"/>
+          <w:szCs w:val="26"/>
+          <w:lang w:val="vi-VN"/>
+        </w:rPr>
+      </w:pPr>
+      <w:r>
+        <w:rPr>
+          <w:rFonts w:ascii="Times  New Roman" w:hAnsi="Times  New Roman"/>
+          <w:sz w:val="26"/>
+          <w:szCs w:val="26"/>
+          <w:lang w:val="vi-VN"/>
+        </w:rPr>
+        <w:t>- CÁCH 1: SINH RA NHÉT VÀO R MỚI KTRA, CÁCH 2: SINH RA KIỂM TRA MỚI NHÉT VÀO</w:t>
+      </w:r>
+    </w:p>
+    <w:p>
+      <w:pPr>
+        <w:rPr>
+          <w:rFonts w:ascii="Times  New Roman" w:hAnsi="Times  New Roman"/>
+          <w:sz w:val="26"/>
+          <w:szCs w:val="26"/>
+          <w:lang w:val="vi-VN"/>
+        </w:rPr>
+      </w:pPr>
+      <w:r>
+        <w:rPr>
+          <w:rFonts w:ascii="Times  New Roman" w:hAnsi="Times  New Roman"/>
+          <w:sz w:val="26"/>
+          <w:szCs w:val="26"/>
+          <w:lang w:val="vi-VN"/>
+        </w:rPr>
+        <w:t>- Độ phức tạp: O (b</w:t>
+      </w:r>
+      <w:r>
+        <w:rPr>
+          <w:rFonts w:ascii="Times  New Roman" w:hAnsi="Times  New Roman"/>
+          <w:sz w:val="26"/>
+          <w:szCs w:val="26"/>
+          <w:vertAlign w:val="superscript"/>
+          <w:lang w:val="vi-VN"/>
+        </w:rPr>
+        <w:t xml:space="preserve">d </w:t>
+      </w:r>
+      <w:r>
+        <w:rPr>
+          <w:rFonts w:ascii="Times  New Roman" w:hAnsi="Times  New Roman"/>
+          <w:sz w:val="26"/>
+          <w:szCs w:val="26"/>
+          <w:lang w:val="vi-VN"/>
+        </w:rPr>
+        <w:t>với b là số nhánh, d là độ sâu của cây</w:t>
+      </w:r>
+      <w:r>
+        <w:rPr>
+          <w:rFonts w:ascii="Times  New Roman" w:hAnsi="Times  New Roman"/>
+          <w:sz w:val="26"/>
+          <w:szCs w:val="26"/>
+          <w:lang w:val="vi-VN"/>
+        </w:rPr>
+        <w:t xml:space="preserve"> tại vị trí nút tìm ra mục tiêu</w:t>
+      </w:r>
+      <w:r>
+        <w:rPr>
+          <w:rFonts w:ascii="Times  New Roman" w:hAnsi="Times  New Roman"/>
+          <w:sz w:val="26"/>
+          <w:szCs w:val="26"/>
+          <w:lang w:val="vi-VN"/>
+        </w:rPr>
+        <w:t>)</w:t>
+      </w:r>
+      <w:r>
+        <w:rPr>
+          <w:rFonts w:ascii="Times  New Roman" w:hAnsi="Times  New Roman"/>
+          <w:sz w:val="26"/>
+          <w:szCs w:val="26"/>
+          <w:lang w:val="vi-VN"/>
+        </w:rPr>
+        <w:t xml:space="preserve"> (không gian = thời gian)</w:t>
+      </w:r>
+    </w:p>
+    <w:p>
+      <w:pPr>
+        <w:rPr>
+          <w:rFonts w:ascii="Times  New Roman" w:hAnsi="Times  New Roman"/>
+          <w:color w:val="EE0000"/>
+          <w:sz w:val="26"/>
+          <w:szCs w:val="26"/>
+          <w:lang w:val="vi-VN"/>
+        </w:rPr>
+      </w:pPr>
+      <w:r>
+        <w:rPr>
+          <w:rFonts w:ascii="Times  New Roman" w:hAnsi="Times  New Roman"/>
+          <w:color w:val="EE0000"/>
+          <w:sz w:val="26"/>
+          <w:szCs w:val="26"/>
+          <w:lang w:val="vi-VN"/>
+        </w:rPr>
+        <w:t>*</w:t>
+      </w:r>
+      <w:r>
+        <w:rPr>
+          <w:rFonts w:ascii="Times  New Roman" w:hAnsi="Times  New Roman"/>
+          <w:color w:val="EE0000"/>
+          <w:sz w:val="26"/>
+          <w:szCs w:val="26"/>
+          <w:lang w:val="vi-VN"/>
+        </w:rPr>
+        <w:t>DFS(stack-LIFO) (STACK CÓ ĐÁY, QUEUE KO CÓ ĐÁY)</w:t>
+      </w:r>
+    </w:p>
+    <w:p>
+      <w:pPr>
+        <w:rPr>
+          <w:rFonts w:ascii="Times  New Roman" w:hAnsi="Times  New Roman"/>
+          <w:color w:val="000000" w:themeColor="text1"/>
+          <w:sz w:val="26"/>
+          <w:szCs w:val="26"/>
+          <w:lang w:val="vi-VN"/>
+        </w:rPr>
+      </w:pPr>
+      <w:r>
+        <w:rPr>
+          <w:rFonts w:ascii="Times  New Roman" w:hAnsi="Times  New Roman"/>
+          <w:color w:val="000000" w:themeColor="text1"/>
+          <w:sz w:val="26"/>
+          <w:szCs w:val="26"/>
+          <w:lang w:val="vi-VN"/>
+        </w:rPr>
+        <w:t>- Độ phức tạp: O(b * m, với m là chiều sâu của cây) (không gian), thời gian = BFS</w:t>
+      </w:r>
+    </w:p>
+    <w:p>
+      <w:pPr>
+        <w:rPr>
+          <w:rFonts w:ascii="Times  New Roman" w:hAnsi="Times  New Roman"/>
+          <w:color w:val="000000" w:themeColor="text1"/>
+          <w:sz w:val="26"/>
+          <w:szCs w:val="26"/>
+          <w:lang w:val="vi-VN"/>
+        </w:rPr>
+      </w:pPr>
+      <w:r>
+        <w:rPr>
+          <w:rFonts w:ascii="Times  New Roman" w:hAnsi="Times  New Roman"/>
+          <w:color w:val="000000" w:themeColor="text1"/>
+          <w:sz w:val="26"/>
+          <w:szCs w:val="26"/>
+          <w:lang w:val="vi-VN"/>
+        </w:rPr>
+        <w:t>- Lời về không gian lưu trữ, không lời hơn về mặt thời gian</w:t>
+      </w:r>
+    </w:p>
+    <w:p>
+      <w:pPr>
+        <w:rPr>
+          <w:rFonts w:ascii="Times  New Roman" w:hAnsi="Times  New Roman"/>
+          <w:color w:val="000000" w:themeColor="text1"/>
+          <w:sz w:val="26"/>
+          <w:szCs w:val="26"/>
+          <w:lang w:val="vi-VN"/>
+        </w:rPr>
+      </w:pPr>
+      <w:r>
+        <w:rPr>
+          <w:rFonts w:ascii="Times  New Roman" w:hAnsi="Times  New Roman"/>
+          <w:color w:val="000000" w:themeColor="text1"/>
+          <w:sz w:val="26"/>
+          <w:szCs w:val="26"/>
+          <w:lang w:val="vi-VN"/>
+        </w:rPr>
+        <w:t>=&gt; Cả 2 đều có tính hoàn toàn, không tối ưu(do có yếu tố random)</w:t>
+      </w:r>
     </w:p>
     <w:sectPr>
       <w:pgSz w:w="12240" w:h="15840"/>

</xml_diff>